<commit_message>
removed miltiary time format
</commit_message>
<xml_diff>
--- a/backend/template_files/DTR_AS_template.docx
+++ b/backend/template_files/DTR_AS_template.docx
@@ -641,6 +641,418 @@
               </w:rPr>
               <w:t>IN</w:t>
             </w:r>
+          </w:p>
+        </w:tc>
+        <w:tc>
+          <w:tcPr>
+            <w:tcW w:w="3600" w:type="dxa"/>
+          </w:tcPr>
+          <w:p>
+            <w:pPr>
+              <w:rPr>
+                <w:rFonts w:ascii="Arial" w:eastAsia="Arial" w:hAnsi="Arial" w:cs="Arial"/>
+                <w:sz w:val="18"/>
+                <w:szCs w:val="18"/>
+              </w:rPr>
+            </w:pPr>
+          </w:p>
+        </w:tc>
+      </w:tr>
+      <w:tr>
+        <w:trPr>
+          <w:trHeight w:val="252"/>
+        </w:trPr>
+        <w:tc>
+          <w:tcPr>
+            <w:tcW w:w="1305" w:type="dxa"/>
+          </w:tcPr>
+          <w:p>
+            <w:pPr>
+              <w:rPr>
+                <w:rFonts w:ascii="Arial" w:eastAsia="Arial" w:hAnsi="Arial" w:cs="Arial"/>
+                <w:color w:val="000000"/>
+                <w:sz w:val="20"/>
+                <w:szCs w:val="20"/>
+              </w:rPr>
+            </w:pPr>
+          </w:p>
+        </w:tc>
+        <w:tc>
+          <w:tcPr>
+            <w:tcW w:w="720" w:type="dxa"/>
+          </w:tcPr>
+          <w:p>
+            <w:pPr>
+              <w:jc w:val="center"/>
+              <w:rPr>
+                <w:rFonts w:ascii="Arial" w:eastAsia="Arial" w:hAnsi="Arial" w:cs="Arial"/>
+                <w:color w:val="000000"/>
+              </w:rPr>
+            </w:pPr>
+          </w:p>
+        </w:tc>
+        <w:tc>
+          <w:tcPr>
+            <w:tcW w:w="735" w:type="dxa"/>
+          </w:tcPr>
+          <w:p>
+            <w:pPr>
+              <w:jc w:val="center"/>
+              <w:rPr>
+                <w:rFonts w:ascii="Arial" w:eastAsia="Arial" w:hAnsi="Arial" w:cs="Arial"/>
+                <w:color w:val="000000"/>
+              </w:rPr>
+            </w:pPr>
+          </w:p>
+        </w:tc>
+        <w:tc>
+          <w:tcPr>
+            <w:tcW w:w="765" w:type="dxa"/>
+            <w:gridSpan w:val="2"/>
+          </w:tcPr>
+          <w:p>
+            <w:pPr>
+              <w:rPr>
+                <w:rFonts w:ascii="Arial" w:eastAsia="Arial" w:hAnsi="Arial" w:cs="Arial"/>
+              </w:rPr>
+            </w:pPr>
+          </w:p>
+        </w:tc>
+        <w:tc>
+          <w:tcPr>
+            <w:tcW w:w="765" w:type="dxa"/>
+            <w:gridSpan w:val="2"/>
+          </w:tcPr>
+          <w:p>
+            <w:pPr>
+              <w:rPr>
+                <w:rFonts w:ascii="Arial" w:eastAsia="Arial" w:hAnsi="Arial" w:cs="Arial"/>
+                <w:color w:val="000000"/>
+              </w:rPr>
+            </w:pPr>
+          </w:p>
+        </w:tc>
+        <w:tc>
+          <w:tcPr>
+            <w:tcW w:w="645" w:type="dxa"/>
+          </w:tcPr>
+          <w:p>
+            <w:pPr>
+              <w:rPr>
+                <w:rFonts w:ascii="Arial" w:eastAsia="Arial" w:hAnsi="Arial" w:cs="Arial"/>
+                <w:sz w:val="18"/>
+                <w:szCs w:val="18"/>
+              </w:rPr>
+            </w:pPr>
+          </w:p>
+        </w:tc>
+        <w:tc>
+          <w:tcPr>
+            <w:tcW w:w="3600" w:type="dxa"/>
+          </w:tcPr>
+          <w:p>
+            <w:pPr>
+              <w:rPr>
+                <w:rFonts w:ascii="Arial" w:eastAsia="Arial" w:hAnsi="Arial" w:cs="Arial"/>
+                <w:sz w:val="18"/>
+                <w:szCs w:val="18"/>
+              </w:rPr>
+            </w:pPr>
+          </w:p>
+        </w:tc>
+      </w:tr>
+      <w:tr>
+        <w:trPr>
+          <w:trHeight w:val="252"/>
+        </w:trPr>
+        <w:tc>
+          <w:tcPr>
+            <w:tcW w:w="1305" w:type="dxa"/>
+          </w:tcPr>
+          <w:p>
+            <w:pPr>
+              <w:rPr>
+                <w:rFonts w:ascii="Arial" w:eastAsia="Arial" w:hAnsi="Arial" w:cs="Arial"/>
+                <w:color w:val="000000"/>
+                <w:sz w:val="20"/>
+                <w:szCs w:val="20"/>
+              </w:rPr>
+            </w:pPr>
+          </w:p>
+        </w:tc>
+        <w:tc>
+          <w:tcPr>
+            <w:tcW w:w="720" w:type="dxa"/>
+          </w:tcPr>
+          <w:p>
+            <w:pPr>
+              <w:jc w:val="center"/>
+              <w:rPr>
+                <w:rFonts w:ascii="Arial" w:eastAsia="Arial" w:hAnsi="Arial" w:cs="Arial"/>
+                <w:color w:val="000000"/>
+              </w:rPr>
+            </w:pPr>
+          </w:p>
+        </w:tc>
+        <w:tc>
+          <w:tcPr>
+            <w:tcW w:w="735" w:type="dxa"/>
+          </w:tcPr>
+          <w:p>
+            <w:pPr>
+              <w:jc w:val="center"/>
+              <w:rPr>
+                <w:rFonts w:ascii="Arial" w:eastAsia="Arial" w:hAnsi="Arial" w:cs="Arial"/>
+                <w:color w:val="000000"/>
+              </w:rPr>
+            </w:pPr>
+          </w:p>
+        </w:tc>
+        <w:tc>
+          <w:tcPr>
+            <w:tcW w:w="765" w:type="dxa"/>
+            <w:gridSpan w:val="2"/>
+          </w:tcPr>
+          <w:p>
+            <w:pPr>
+              <w:rPr>
+                <w:rFonts w:ascii="Arial" w:eastAsia="Arial" w:hAnsi="Arial" w:cs="Arial"/>
+              </w:rPr>
+            </w:pPr>
+          </w:p>
+        </w:tc>
+        <w:tc>
+          <w:tcPr>
+            <w:tcW w:w="765" w:type="dxa"/>
+            <w:gridSpan w:val="2"/>
+          </w:tcPr>
+          <w:p>
+            <w:pPr>
+              <w:rPr>
+                <w:rFonts w:ascii="Arial" w:eastAsia="Arial" w:hAnsi="Arial" w:cs="Arial"/>
+                <w:color w:val="000000"/>
+              </w:rPr>
+            </w:pPr>
+          </w:p>
+        </w:tc>
+        <w:tc>
+          <w:tcPr>
+            <w:tcW w:w="645" w:type="dxa"/>
+          </w:tcPr>
+          <w:p>
+            <w:pPr>
+              <w:rPr>
+                <w:rFonts w:ascii="Arial" w:eastAsia="Arial" w:hAnsi="Arial" w:cs="Arial"/>
+                <w:sz w:val="18"/>
+                <w:szCs w:val="18"/>
+              </w:rPr>
+            </w:pPr>
+          </w:p>
+        </w:tc>
+        <w:tc>
+          <w:tcPr>
+            <w:tcW w:w="3600" w:type="dxa"/>
+          </w:tcPr>
+          <w:p>
+            <w:pPr>
+              <w:rPr>
+                <w:rFonts w:ascii="Arial" w:eastAsia="Arial" w:hAnsi="Arial" w:cs="Arial"/>
+                <w:sz w:val="18"/>
+                <w:szCs w:val="18"/>
+              </w:rPr>
+            </w:pPr>
+          </w:p>
+        </w:tc>
+      </w:tr>
+      <w:tr>
+        <w:trPr>
+          <w:trHeight w:val="252"/>
+        </w:trPr>
+        <w:tc>
+          <w:tcPr>
+            <w:tcW w:w="1305" w:type="dxa"/>
+          </w:tcPr>
+          <w:p>
+            <w:pPr>
+              <w:rPr>
+                <w:rFonts w:ascii="Arial" w:eastAsia="Arial" w:hAnsi="Arial" w:cs="Arial"/>
+                <w:color w:val="000000"/>
+                <w:sz w:val="20"/>
+                <w:szCs w:val="20"/>
+              </w:rPr>
+            </w:pPr>
+          </w:p>
+        </w:tc>
+        <w:tc>
+          <w:tcPr>
+            <w:tcW w:w="720" w:type="dxa"/>
+          </w:tcPr>
+          <w:p>
+            <w:pPr>
+              <w:jc w:val="center"/>
+              <w:rPr>
+                <w:rFonts w:ascii="Arial" w:eastAsia="Arial" w:hAnsi="Arial" w:cs="Arial"/>
+                <w:color w:val="000000"/>
+              </w:rPr>
+            </w:pPr>
+          </w:p>
+        </w:tc>
+        <w:tc>
+          <w:tcPr>
+            <w:tcW w:w="735" w:type="dxa"/>
+          </w:tcPr>
+          <w:p>
+            <w:pPr>
+              <w:jc w:val="center"/>
+              <w:rPr>
+                <w:rFonts w:ascii="Arial" w:eastAsia="Arial" w:hAnsi="Arial" w:cs="Arial"/>
+                <w:color w:val="000000"/>
+              </w:rPr>
+            </w:pPr>
+          </w:p>
+        </w:tc>
+        <w:tc>
+          <w:tcPr>
+            <w:tcW w:w="765" w:type="dxa"/>
+            <w:gridSpan w:val="2"/>
+          </w:tcPr>
+          <w:p>
+            <w:pPr>
+              <w:rPr>
+                <w:rFonts w:ascii="Arial" w:eastAsia="Arial" w:hAnsi="Arial" w:cs="Arial"/>
+              </w:rPr>
+            </w:pPr>
+          </w:p>
+        </w:tc>
+        <w:tc>
+          <w:tcPr>
+            <w:tcW w:w="765" w:type="dxa"/>
+            <w:gridSpan w:val="2"/>
+          </w:tcPr>
+          <w:p>
+            <w:pPr>
+              <w:rPr>
+                <w:rFonts w:ascii="Arial" w:eastAsia="Arial" w:hAnsi="Arial" w:cs="Arial"/>
+                <w:color w:val="000000"/>
+              </w:rPr>
+            </w:pPr>
+          </w:p>
+        </w:tc>
+        <w:tc>
+          <w:tcPr>
+            <w:tcW w:w="645" w:type="dxa"/>
+          </w:tcPr>
+          <w:p>
+            <w:pPr>
+              <w:rPr>
+                <w:rFonts w:ascii="Arial" w:eastAsia="Arial" w:hAnsi="Arial" w:cs="Arial"/>
+                <w:sz w:val="18"/>
+                <w:szCs w:val="18"/>
+              </w:rPr>
+            </w:pPr>
+          </w:p>
+        </w:tc>
+        <w:tc>
+          <w:tcPr>
+            <w:tcW w:w="3600" w:type="dxa"/>
+          </w:tcPr>
+          <w:p>
+            <w:pPr>
+              <w:rPr>
+                <w:rFonts w:ascii="Arial" w:eastAsia="Arial" w:hAnsi="Arial" w:cs="Arial"/>
+                <w:sz w:val="18"/>
+                <w:szCs w:val="18"/>
+              </w:rPr>
+            </w:pPr>
+          </w:p>
+        </w:tc>
+      </w:tr>
+      <w:tr>
+        <w:trPr>
+          <w:trHeight w:val="252"/>
+        </w:trPr>
+        <w:tc>
+          <w:tcPr>
+            <w:tcW w:w="1305" w:type="dxa"/>
+          </w:tcPr>
+          <w:p>
+            <w:pPr>
+              <w:rPr>
+                <w:rFonts w:ascii="Arial" w:eastAsia="Arial" w:hAnsi="Arial" w:cs="Arial"/>
+                <w:color w:val="000000"/>
+                <w:sz w:val="20"/>
+                <w:szCs w:val="20"/>
+              </w:rPr>
+            </w:pPr>
+          </w:p>
+        </w:tc>
+        <w:tc>
+          <w:tcPr>
+            <w:tcW w:w="720" w:type="dxa"/>
+          </w:tcPr>
+          <w:p>
+            <w:pPr>
+              <w:jc w:val="center"/>
+              <w:rPr>
+                <w:rFonts w:ascii="Arial" w:eastAsia="Arial" w:hAnsi="Arial" w:cs="Arial"/>
+                <w:color w:val="000000"/>
+              </w:rPr>
+            </w:pPr>
+          </w:p>
+        </w:tc>
+        <w:tc>
+          <w:tcPr>
+            <w:tcW w:w="735" w:type="dxa"/>
+          </w:tcPr>
+          <w:p>
+            <w:pPr>
+              <w:jc w:val="center"/>
+              <w:rPr>
+                <w:rFonts w:ascii="Arial" w:eastAsia="Arial" w:hAnsi="Arial" w:cs="Arial"/>
+                <w:color w:val="000000"/>
+              </w:rPr>
+            </w:pPr>
+          </w:p>
+        </w:tc>
+        <w:tc>
+          <w:tcPr>
+            <w:tcW w:w="765" w:type="dxa"/>
+            <w:gridSpan w:val="2"/>
+          </w:tcPr>
+          <w:p>
+            <w:pPr>
+              <w:rPr>
+                <w:rFonts w:ascii="Arial" w:eastAsia="Arial" w:hAnsi="Arial" w:cs="Arial"/>
+              </w:rPr>
+            </w:pPr>
+          </w:p>
+        </w:tc>
+        <w:tc>
+          <w:tcPr>
+            <w:tcW w:w="765" w:type="dxa"/>
+            <w:gridSpan w:val="2"/>
+          </w:tcPr>
+          <w:p>
+            <w:pPr>
+              <w:rPr>
+                <w:rFonts w:ascii="Arial" w:eastAsia="Arial" w:hAnsi="Arial" w:cs="Arial"/>
+                <w:color w:val="000000"/>
+              </w:rPr>
+            </w:pPr>
+          </w:p>
+        </w:tc>
+        <w:tc>
+          <w:tcPr>
+            <w:tcW w:w="645" w:type="dxa"/>
+          </w:tcPr>
+          <w:p>
+            <w:pPr>
+              <w:rPr>
+                <w:rFonts w:ascii="Arial" w:eastAsia="Arial" w:hAnsi="Arial" w:cs="Arial"/>
+                <w:sz w:val="18"/>
+                <w:szCs w:val="18"/>
+              </w:rPr>
+            </w:pPr>
           </w:p>
         </w:tc>
         <w:tc>

</xml_diff>